<commit_message>
Cambios Xpath Javier Sanchez
</commit_message>
<xml_diff>
--- a/evidencias/carpetaEjercicio_Eduardo/reporteDeCasoDePruebaEjercicio_Eduardo.docx
+++ b/evidencias/carpetaEjercicio_Eduardo/reporteDeCasoDePruebaEjercicio_Eduardo.docx
@@ -284,23 +284,63 @@
     <w:p/>
     <w:p>
       <w:r>
+        <w:t>Se hizo una espera de 5</w:t>
+        <w:br/>
+        <w:drawing>
+          <wp:inline distT="0" distR="0" distB="0" distL="0">
+            <wp:extent cx="3810000" cy="2540000"/>
+            <wp:docPr id="7" name="Drawing 7" descr="007Se_hizo_una_espera_de_5.png"/>
+            <a:graphic xmlns:a="http://schemas.openxmlformats.org/drawingml/2006/main">
+              <a:graphicData uri="http://schemas.openxmlformats.org/drawingml/2006/picture">
+                <pic:pic xmlns:pic="http://schemas.openxmlformats.org/drawingml/2006/picture">
+                  <pic:nvPicPr>
+                    <pic:cNvPr id="0" name="Picture 7" descr="007Se_hizo_una_espera_de_5.png"/>
+                    <pic:cNvPicPr>
+                      <a:picLocks noChangeAspect="true"/>
+                    </pic:cNvPicPr>
+                  </pic:nvPicPr>
+                  <pic:blipFill>
+                    <a:blip r:embed="rId9"/>
+                    <a:stretch>
+                      <a:fillRect/>
+                    </a:stretch>
+                  </pic:blipFill>
+                  <pic:spPr>
+                    <a:xfrm>
+                      <a:off x="0" y="0"/>
+                      <a:ext cx="3810000" cy="2540000"/>
+                    </a:xfrm>
+                    <a:prstGeom prst="rect">
+                      <a:avLst/>
+                    </a:prstGeom>
+                  </pic:spPr>
+                </pic:pic>
+              </a:graphicData>
+            </a:graphic>
+          </wp:inline>
+        </w:drawing>
+      </w:r>
+    </w:p>
+    <w:p/>
+    <w:p>
+      <w:r>
         <w:t>Se da un clic en boton PIM</w:t>
         <w:br/>
         <w:drawing>
           <wp:inline distT="0" distR="0" distB="0" distL="0">
             <wp:extent cx="3810000" cy="2540000"/>
-            <wp:docPr id="7" name="Drawing 7" descr="008Se_da_un_clic_en_boton_PIM.png"/>
-            <a:graphic xmlns:a="http://schemas.openxmlformats.org/drawingml/2006/main">
-              <a:graphicData uri="http://schemas.openxmlformats.org/drawingml/2006/picture">
-                <pic:pic xmlns:pic="http://schemas.openxmlformats.org/drawingml/2006/picture">
-                  <pic:nvPicPr>
-                    <pic:cNvPr id="0" name="Picture 7" descr="008Se_da_un_clic_en_boton_PIM.png"/>
-                    <pic:cNvPicPr>
-                      <a:picLocks noChangeAspect="true"/>
-                    </pic:cNvPicPr>
-                  </pic:nvPicPr>
-                  <pic:blipFill>
-                    <a:blip r:embed="rId9"/>
+            <wp:docPr id="8" name="Drawing 8" descr="008Se_da_un_clic_en_boton_PIM.png"/>
+            <a:graphic xmlns:a="http://schemas.openxmlformats.org/drawingml/2006/main">
+              <a:graphicData uri="http://schemas.openxmlformats.org/drawingml/2006/picture">
+                <pic:pic xmlns:pic="http://schemas.openxmlformats.org/drawingml/2006/picture">
+                  <pic:nvPicPr>
+                    <pic:cNvPr id="0" name="Picture 8" descr="008Se_da_un_clic_en_boton_PIM.png"/>
+                    <pic:cNvPicPr>
+                      <a:picLocks noChangeAspect="true"/>
+                    </pic:cNvPicPr>
+                  </pic:nvPicPr>
+                  <pic:blipFill>
+                    <a:blip r:embed="rId10"/>
                     <a:stretch>
                       <a:fillRect/>
                     </a:stretch>
@@ -329,18 +369,58 @@
         <w:drawing>
           <wp:inline distT="0" distR="0" distB="0" distL="0">
             <wp:extent cx="3810000" cy="2540000"/>
-            <wp:docPr id="8" name="Drawing 8" descr="009Se_hizo_una_espera_de_10.png"/>
-            <a:graphic xmlns:a="http://schemas.openxmlformats.org/drawingml/2006/main">
-              <a:graphicData uri="http://schemas.openxmlformats.org/drawingml/2006/picture">
-                <pic:pic xmlns:pic="http://schemas.openxmlformats.org/drawingml/2006/picture">
-                  <pic:nvPicPr>
-                    <pic:cNvPr id="0" name="Picture 8" descr="009Se_hizo_una_espera_de_10.png"/>
-                    <pic:cNvPicPr>
-                      <a:picLocks noChangeAspect="true"/>
-                    </pic:cNvPicPr>
-                  </pic:nvPicPr>
-                  <pic:blipFill>
-                    <a:blip r:embed="rId10"/>
+            <wp:docPr id="9" name="Drawing 9" descr="009Se_hizo_una_espera_de_10.png"/>
+            <a:graphic xmlns:a="http://schemas.openxmlformats.org/drawingml/2006/main">
+              <a:graphicData uri="http://schemas.openxmlformats.org/drawingml/2006/picture">
+                <pic:pic xmlns:pic="http://schemas.openxmlformats.org/drawingml/2006/picture">
+                  <pic:nvPicPr>
+                    <pic:cNvPr id="0" name="Picture 9" descr="009Se_hizo_una_espera_de_10.png"/>
+                    <pic:cNvPicPr>
+                      <a:picLocks noChangeAspect="true"/>
+                    </pic:cNvPicPr>
+                  </pic:nvPicPr>
+                  <pic:blipFill>
+                    <a:blip r:embed="rId11"/>
+                    <a:stretch>
+                      <a:fillRect/>
+                    </a:stretch>
+                  </pic:blipFill>
+                  <pic:spPr>
+                    <a:xfrm>
+                      <a:off x="0" y="0"/>
+                      <a:ext cx="3810000" cy="2540000"/>
+                    </a:xfrm>
+                    <a:prstGeom prst="rect">
+                      <a:avLst/>
+                    </a:prstGeom>
+                  </pic:spPr>
+                </pic:pic>
+              </a:graphicData>
+            </a:graphic>
+          </wp:inline>
+        </w:drawing>
+      </w:r>
+    </w:p>
+    <w:p/>
+    <w:p>
+      <w:r>
+        <w:t>Se hizo una espera de 4</w:t>
+        <w:br/>
+        <w:drawing>
+          <wp:inline distT="0" distR="0" distB="0" distL="0">
+            <wp:extent cx="3810000" cy="2540000"/>
+            <wp:docPr id="10" name="Drawing 10" descr="009Se_hizo_una_espera_de_4.png"/>
+            <a:graphic xmlns:a="http://schemas.openxmlformats.org/drawingml/2006/main">
+              <a:graphicData uri="http://schemas.openxmlformats.org/drawingml/2006/picture">
+                <pic:pic xmlns:pic="http://schemas.openxmlformats.org/drawingml/2006/picture">
+                  <pic:nvPicPr>
+                    <pic:cNvPr id="0" name="Picture 10" descr="009Se_hizo_una_espera_de_4.png"/>
+                    <pic:cNvPicPr>
+                      <a:picLocks noChangeAspect="true"/>
+                    </pic:cNvPicPr>
+                  </pic:nvPicPr>
+                  <pic:blipFill>
+                    <a:blip r:embed="rId12"/>
                     <a:stretch>
                       <a:fillRect/>
                     </a:stretch>

</xml_diff>